<commit_message>
Add Section 10: justify minimal sufficient adjustment set vs ancestor confounders
</commit_message>
<xml_diff>
--- a/teaching/Methodology_Worked_Example_Muritala.docx
+++ b/teaching/Methodology_Worked_Example_Muritala.docx
@@ -6277,6 +6277,314 @@
           <w:szCs w:val="22"/>
         </w:rPr>
         <w:t xml:space="preserve">None of that changes what AIPTW is doing: combine a treatment model and an outcome model so that one correct model is enough.</w:t>
+      </w:r>
+    </w:p>
+    <w:p>
+      <w:pPr>
+        <w:keepNext/>
+        <w:pBdr>
+          <w:bottom w:val="single" w:color="1F3864" w:sz="6" w:space="3"/>
+        </w:pBdr>
+        <w:spacing w:after="130" w:before="320"/>
+      </w:pPr>
+      <w:r>
+        <w:rPr>
+          <w:rFonts w:ascii="Calibri" w:cs="Calibri" w:eastAsia="Calibri" w:hAnsi="Calibri"/>
+          <w:b/>
+          <w:bCs/>
+          <w:color w:val="1F3864"/>
+          <w:sz w:val="26"/>
+          <w:szCs w:val="26"/>
+        </w:rPr>
+        <w:t xml:space="preserve">10. Why the Minimal Sufficient Set Cannot Be Shrunk to Just the "Ancestor" Confounders</w:t>
+      </w:r>
+    </w:p>
+    <w:p>
+      <w:pPr>
+        <w:spacing w:after="140" w:line="268"/>
+        <w:jc w:val="both"/>
+      </w:pPr>
+      <w:r>
+        <w:rPr>
+          <w:rFonts w:ascii="Calibri" w:cs="Calibri" w:eastAsia="Calibri" w:hAnsi="Calibri"/>
+          <w:sz w:val="22"/>
+          <w:szCs w:val="22"/>
+        </w:rPr>
+        <w:t xml:space="preserve">A natural question after looking at Figure 2b (the assumed ordering among the ten confounders) is this: if race and maternal age sit upstream of the other confounders, why not just adjust for race and age, since blocking an upstream node should block everything downstream of it too? This section works through why that reasoning does not hold for this DAG, and it matters because it is exactly the kind of question a reviewer or advisor is likely to ask.</w:t>
+      </w:r>
+    </w:p>
+    <w:p>
+      <w:pPr>
+        <w:keepNext/>
+        <w:spacing w:after="90" w:before="200"/>
+      </w:pPr>
+      <w:r>
+        <w:rPr>
+          <w:rFonts w:ascii="Calibri" w:cs="Calibri" w:eastAsia="Calibri" w:hAnsi="Calibri"/>
+          <w:b/>
+          <w:bCs/>
+          <w:color w:val="1F3864"/>
+          <w:sz w:val="22"/>
+          <w:szCs w:val="22"/>
+        </w:rPr>
+        <w:t xml:space="preserve">Confounder versus collider: a terminology check first</w:t>
+      </w:r>
+    </w:p>
+    <w:p>
+      <w:pPr>
+        <w:spacing w:after="140" w:line="268"/>
+        <w:jc w:val="both"/>
+      </w:pPr>
+      <w:r>
+        <w:rPr>
+          <w:rFonts w:ascii="Calibri" w:cs="Calibri" w:eastAsia="Calibri" w:hAnsi="Calibri"/>
+          <w:sz w:val="22"/>
+          <w:szCs w:val="22"/>
+        </w:rPr>
+        <w:t xml:space="preserve">A confounder has arrows pointing </w:t>
+      </w:r>
+      <w:r>
+        <w:rPr>
+          <w:rFonts w:ascii="Calibri" w:cs="Calibri" w:eastAsia="Calibri" w:hAnsi="Calibri"/>
+          <w:i/>
+          <w:iCs/>
+          <w:sz w:val="22"/>
+          <w:szCs w:val="22"/>
+        </w:rPr>
+        <w:t xml:space="preserve">out</w:t>
+      </w:r>
+      <w:r>
+        <w:rPr>
+          <w:rFonts w:ascii="Calibri" w:cs="Calibri" w:eastAsia="Calibri" w:hAnsi="Calibri"/>
+          <w:sz w:val="22"/>
+          <w:szCs w:val="22"/>
+        </w:rPr>
+        <w:t xml:space="preserve"> toward both T and Y (Xi → T and Xi → Y): a common cause. A collider has arrows pointing </w:t>
+      </w:r>
+      <w:r>
+        <w:rPr>
+          <w:rFonts w:ascii="Calibri" w:cs="Calibri" w:eastAsia="Calibri" w:hAnsi="Calibri"/>
+          <w:i/>
+          <w:iCs/>
+          <w:sz w:val="22"/>
+          <w:szCs w:val="22"/>
+        </w:rPr>
+        <w:t xml:space="preserve">in</w:t>
+      </w:r>
+      <w:r>
+        <w:rPr>
+          <w:rFonts w:ascii="Calibri" w:cs="Calibri" w:eastAsia="Calibri" w:hAnsi="Calibri"/>
+          <w:sz w:val="22"/>
+          <w:szCs w:val="22"/>
+        </w:rPr>
+        <w:t xml:space="preserve"> from both T and Y (T → C ← Y): a common effect. The rule for a confounder is to condition on it, closing the extra backdoor path it creates. The rule for a collider is the opposite: conditioning on one </w:t>
+      </w:r>
+      <w:r>
+        <w:rPr>
+          <w:rFonts w:ascii="Calibri" w:cs="Calibri" w:eastAsia="Calibri" w:hAnsi="Calibri"/>
+          <w:i/>
+          <w:iCs/>
+          <w:sz w:val="22"/>
+          <w:szCs w:val="22"/>
+        </w:rPr>
+        <w:t xml:space="preserve">opens</w:t>
+      </w:r>
+      <w:r>
+        <w:rPr>
+          <w:rFonts w:ascii="Calibri" w:cs="Calibri" w:eastAsia="Calibri" w:hAnsi="Calibri"/>
+          <w:sz w:val="22"/>
+          <w:szCs w:val="22"/>
+        </w:rPr>
+        <w:t xml:space="preserve"> a path that was otherwise closed, introducing new, spurious bias. Every one of the ten variables in the adjustment set was individually verified in Section 7 of the proposal to plausibly cause both smoking and preterm birth directly, which is the confounder pattern. None of them are colliders, and none should be treated with collider logic.</w:t>
+      </w:r>
+    </w:p>
+    <w:p>
+      <w:pPr>
+        <w:keepNext/>
+        <w:spacing w:after="90" w:before="200"/>
+      </w:pPr>
+      <w:r>
+        <w:rPr>
+          <w:rFonts w:ascii="Calibri" w:cs="Calibri" w:eastAsia="Calibri" w:hAnsi="Calibri"/>
+          <w:b/>
+          <w:bCs/>
+          <w:color w:val="1F3864"/>
+          <w:sz w:val="22"/>
+          <w:szCs w:val="22"/>
+        </w:rPr>
+        <w:t xml:space="preserve">Blocking an ancestor only blocks the paths that run through it</w:t>
+      </w:r>
+    </w:p>
+    <w:p>
+      <w:pPr>
+        <w:spacing w:after="140" w:line="268"/>
+        <w:jc w:val="both"/>
+      </w:pPr>
+      <w:r>
+        <w:rPr>
+          <w:rFonts w:ascii="Calibri" w:cs="Calibri" w:eastAsia="Calibri" w:hAnsi="Calibri"/>
+          <w:sz w:val="22"/>
+          <w:szCs w:val="22"/>
+        </w:rPr>
+        <w:t xml:space="preserve">In the identification DAG (Figure 2a), every one of the ten confounders is drawn as its own direct parent of both T and Y. That is exactly what the node-by-node defense established for each variable individually: does this variable plausibly cause smoking on its own, not does something upstream of it cause smoking. The diagram therefore contains ten separate, parallel backdoor paths: T ← Race → Y, T ← Age → Y, T ← Education → Y, T ← BMI → Y, and so on for every remaining confounder.</w:t>
+      </w:r>
+    </w:p>
+    <w:p>
+      <w:pPr>
+        <w:spacing w:after="140" w:line="268"/>
+        <w:jc w:val="both"/>
+      </w:pPr>
+      <w:r>
+        <w:rPr>
+          <w:rFonts w:ascii="Calibri" w:cs="Calibri" w:eastAsia="Calibri" w:hAnsi="Calibri"/>
+          <w:sz w:val="22"/>
+          <w:szCs w:val="22"/>
+        </w:rPr>
+        <w:t xml:space="preserve">Conditioning on race blocks only the one path that contains the race node. It does nothing to T ← Education → Y, because that path does not have a race node sitting on it; it is a direct arrow from education straight into both T and Y. D-separation requires conditioning on a non-collider node that lies </w:t>
+      </w:r>
+      <w:r>
+        <w:rPr>
+          <w:rFonts w:ascii="Calibri" w:cs="Calibri" w:eastAsia="Calibri" w:hAnsi="Calibri"/>
+          <w:i/>
+          <w:iCs/>
+          <w:sz w:val="22"/>
+          <w:szCs w:val="22"/>
+        </w:rPr>
+        <w:t xml:space="preserve">on</w:t>
+      </w:r>
+      <w:r>
+        <w:rPr>
+          <w:rFonts w:ascii="Calibri" w:cs="Calibri" w:eastAsia="Calibri" w:hAnsi="Calibri"/>
+          <w:sz w:val="22"/>
+          <w:szCs w:val="22"/>
+        </w:rPr>
+        <w:t xml:space="preserve"> the specific path being blocked. Race and age simply are not on the education path, no matter how the confounders are ordered relative to one another.</w:t>
+      </w:r>
+    </w:p>
+    <w:p>
+      <w:pPr>
+        <w:keepNext/>
+        <w:spacing w:after="90" w:before="200"/>
+      </w:pPr>
+      <w:r>
+        <w:rPr>
+          <w:rFonts w:ascii="Calibri" w:cs="Calibri" w:eastAsia="Calibri" w:hAnsi="Calibri"/>
+          <w:b/>
+          <w:bCs/>
+          <w:color w:val="1F3864"/>
+          <w:sz w:val="22"/>
+          <w:szCs w:val="22"/>
+        </w:rPr>
+        <w:t xml:space="preserve">Figure 2b's ordering does not erase the direct edges in Figure 2a</w:t>
+      </w:r>
+    </w:p>
+    <w:p>
+      <w:pPr>
+        <w:spacing w:after="140" w:line="268"/>
+        <w:jc w:val="both"/>
+      </w:pPr>
+      <w:r>
+        <w:rPr>
+          <w:rFonts w:ascii="Calibri" w:cs="Calibri" w:eastAsia="Calibri" w:hAnsi="Calibri"/>
+          <w:sz w:val="22"/>
+          <w:szCs w:val="22"/>
+        </w:rPr>
+        <w:t xml:space="preserve">Figure 2b shows an assumed ordering among the confounders themselves (race → education, age → parity, and so on). That is a separate, supplementary claim about how the confounders relate to each other, and it does not remove education's own direct edges into T and Y that Figure 2a already asserts. For "adjust for race alone" to correctly substitute for "adjust for education," education would need to have no direct edge of its own: its entire association with smoking would have to run strictly through race, with nothing left over.</w:t>
+      </w:r>
+    </w:p>
+    <w:p>
+      <w:pPr>
+        <w:spacing w:after="140" w:line="268"/>
+        <w:jc w:val="both"/>
+      </w:pPr>
+      <w:r>
+        <w:rPr>
+          <w:rFonts w:ascii="Calibri" w:cs="Calibri" w:eastAsia="Calibri" w:hAnsi="Calibri"/>
+          <w:sz w:val="22"/>
+          <w:szCs w:val="22"/>
+        </w:rPr>
+        <w:t xml:space="preserve">The real data say otherwise. Education correlates with smoking at r = -0.128 in the 2023 extract, versus r = -0.014 for race and r = -0.006 for age, roughly nine times the magnitude. If race were doing all the work, education's leftover correlation with smoking, after accounting for race, would be close to zero. It is instead the single strongest correlate of smoking among all ten candidate covariates. Education is carrying information about who smokes that race and age do not capture on their own, so it needs its own place in the adjustment set rather than a stand-in.</w:t>
+      </w:r>
+    </w:p>
+    <w:p>
+      <w:pPr>
+        <w:keepNext/>
+        <w:spacing w:after="90" w:before="200"/>
+      </w:pPr>
+      <w:r>
+        <w:rPr>
+          <w:rFonts w:ascii="Calibri" w:cs="Calibri" w:eastAsia="Calibri" w:hAnsi="Calibri"/>
+          <w:b/>
+          <w:bCs/>
+          <w:color w:val="1F3864"/>
+          <w:sz w:val="22"/>
+          <w:szCs w:val="22"/>
+        </w:rPr>
+        <w:t xml:space="preserve">The same logic covers every other confounder, not just education</w:t>
+      </w:r>
+    </w:p>
+    <w:p>
+      <w:pPr>
+        <w:spacing w:after="140" w:line="268"/>
+        <w:jc w:val="both"/>
+      </w:pPr>
+      <w:r>
+        <w:rPr>
+          <w:rFonts w:ascii="Calibri" w:cs="Calibri" w:eastAsia="Calibri" w:hAnsi="Calibri"/>
+          <w:sz w:val="22"/>
+          <w:szCs w:val="22"/>
+        </w:rPr>
+        <w:t xml:space="preserve">This answers the narrower version of the question too: why not just education, race, and age? Each of the remaining seven confounders, BMI, parity, WIC participation, prior preterm birth, pre-pregnancy diabetes, pre-pregnancy hypertension, and prenatal-care timing, passed the same individual test in Section 7: each is judged, on its own substantive merits, to plausibly cause smoking directly, not merely to be a downstream consequence of race, age, or education. Each therefore sits on its own separate backdoor path that none of the other variables touches, and skipping any one of them leaves that specific path open.</w:t>
+      </w:r>
+    </w:p>
+    <w:p>
+      <w:pPr>
+        <w:spacing w:after="140" w:line="268"/>
+        <w:jc w:val="both"/>
+      </w:pPr>
+      <w:r>
+        <w:rPr>
+          <w:rFonts w:ascii="Calibri" w:cs="Calibri" w:eastAsia="Calibri" w:hAnsi="Calibri"/>
+          <w:sz w:val="22"/>
+          <w:szCs w:val="22"/>
+        </w:rPr>
+        <w:t xml:space="preserve">One nuance is worth being explicit about: this is not decided by how large the correlation is. Pre-pregnancy diabetes correlates with smoking at only r = 0.009, far weaker than education's r = -0.128, but that number describes how much bias would result from </w:t>
+      </w:r>
+      <w:r>
+        <w:rPr>
+          <w:rFonts w:ascii="Calibri" w:cs="Calibri" w:eastAsia="Calibri" w:hAnsi="Calibri"/>
+          <w:i/>
+          <w:iCs/>
+          <w:sz w:val="22"/>
+          <w:szCs w:val="22"/>
+        </w:rPr>
+        <w:t xml:space="preserve">ignoring</w:t>
+      </w:r>
+      <w:r>
+        <w:rPr>
+          <w:rFonts w:ascii="Calibri" w:cs="Calibri" w:eastAsia="Calibri" w:hAnsi="Calibri"/>
+          <w:sz w:val="22"/>
+          <w:szCs w:val="22"/>
+        </w:rPr>
+        <w:t xml:space="preserve"> that path, not whether the path needs to be blocked. If the DAG asserts a plausible direct edge into T, the path exists and must be blocked regardless of how weak the resulting correlation looks. "Minimal" in "minimal sufficient adjustment set" means no single one of the ten variables can be dropped without leaving its own path unblocked. It does not mean a smaller set of upstream variables can stand in for the rest, unless those upstream variables can be shown, from the DAG itself rather than assumed, to be the </w:t>
+      </w:r>
+      <w:r>
+        <w:rPr>
+          <w:rFonts w:ascii="Calibri" w:cs="Calibri" w:eastAsia="Calibri" w:hAnsi="Calibri"/>
+          <w:i/>
+          <w:iCs/>
+          <w:sz w:val="22"/>
+          <w:szCs w:val="22"/>
+        </w:rPr>
+        <w:t xml:space="preserve">only</w:t>
+      </w:r>
+      <w:r>
+        <w:rPr>
+          <w:rFonts w:ascii="Calibri" w:cs="Calibri" w:eastAsia="Calibri" w:hAnsi="Calibri"/>
+          <w:sz w:val="22"/>
+          <w:szCs w:val="22"/>
+        </w:rPr>
+        <w:t xml:space="preserve"> source of every downstream variable's association with T and Y. That is not the structure this DAG asserts, and it is not what the correlations in Section 6 of the EDA report support.</w:t>
       </w:r>
     </w:p>
     <w:sectPr>

</xml_diff>